<commit_message>
Moved files into docx and practice folders
</commit_message>
<xml_diff>
--- a/docx/java theory.docx
+++ b/docx/java theory.docx
@@ -3,757 +3,27 @@
 <w:document xmlns:wpc="http://schemas.microsoft.com/office/word/2010/wordprocessingCanvas" xmlns:cx="http://schemas.microsoft.com/office/drawing/2014/chartex" xmlns:cx1="http://schemas.microsoft.com/office/drawing/2015/9/8/chartex" xmlns:cx2="http://schemas.microsoft.com/office/drawing/2015/10/21/chartex" xmlns:cx3="http://schemas.microsoft.com/office/drawing/2016/5/9/chartex" xmlns:cx4="http://schemas.microsoft.com/office/drawing/2016/5/10/chartex" xmlns:cx5="http://schemas.microsoft.com/office/drawing/2016/5/11/chartex" xmlns:cx6="http://schemas.microsoft.com/office/drawing/2016/5/12/chartex" xmlns:cx7="http://schemas.microsoft.com/office/drawing/2016/5/13/chartex" xmlns:cx8="http://schemas.microsoft.com/office/drawing/2016/5/14/chartex" xmlns:mc="http://schemas.openxmlformats.org/markup-compatibility/2006" xmlns:aink="http://schemas.microsoft.com/office/drawing/2016/ink" xmlns:am3d="http://schemas.microsoft.com/office/drawing/2017/model3d" xmlns:o="urn:schemas-microsoft-com:office:office" xmlns:oel="http://schemas.microsoft.com/office/2019/extlst" xmlns:r="http://schemas.openxmlformats.org/officeDocument/2006/relationships" xmlns:m="http://schemas.openxmlformats.org/officeDocument/2006/math" xmlns:v="urn:schemas-microsoft-com:vml" xmlns:wp14="http://schemas.microsoft.com/office/word/2010/wordprocessingDrawing" xmlns:wp="http://schemas.openxmlformats.org/drawingml/2006/wordprocessingDrawing" xmlns:w10="urn:schemas-microsoft-com:office:word" xmlns:w="http://schemas.openxmlformats.org/wordprocessingml/2006/main" xmlns:w14="http://schemas.microsoft.com/office/word/2010/wordml" xmlns:w15="http://schemas.microsoft.com/office/word/2012/wordml" xmlns:w16cex="http://schemas.microsoft.com/office/word/2018/wordml/cex" xmlns:w16cid="http://schemas.microsoft.com/office/word/2016/wordml/cid" xmlns:w16="http://schemas.microsoft.com/office/word/2018/wordml" xmlns:w16du="http://schemas.microsoft.com/office/word/2023/wordml/word16du" xmlns:w16sdtdh="http://schemas.microsoft.com/office/word/2020/wordml/sdtdatahash" xmlns:w16sdtfl="http://schemas.microsoft.com/office/word/2024/wordml/sdtformatlock" xmlns:w16se="http://schemas.microsoft.com/office/word/2015/wordml/symex" xmlns:wpg="http://schemas.microsoft.com/office/word/2010/wordprocessingGroup" xmlns:wpi="http://schemas.microsoft.com/office/word/2010/wordprocessingInk" xmlns:wne="http://schemas.microsoft.com/office/word/2006/wordml" xmlns:wps="http://schemas.microsoft.com/office/word/2010/wordprocessingShape" mc:Ignorable="w14 w15 w16se w16cid w16 w16cex w16sdtdh w16sdtfl w16du wp14">
   <w:body>
     <w:p>
-      <w:pPr>
-        <w:numPr>
-          <w:ilvl w:val="0"/>
-          <w:numId w:val="1"/>
-        </w:numPr>
-      </w:pPr>
       <w:r>
         <w:rPr>
           <w:b/>
           <w:bCs/>
         </w:rPr>
-        <w:t>demo3.java</w:t>
+        <w:t>java files are for you:</w:t>
       </w:r>
       <w:r>
-        <w:t xml:space="preserve"> wo file </w:t>
+        <w:t xml:space="preserve"> This is the code you write, read, and change.</w:t>
       </w:r>
-      <w:proofErr w:type="spellStart"/>
-      <w:r>
-        <w:t>hai</w:t>
-      </w:r>
-      <w:proofErr w:type="spellEnd"/>
-      <w:r>
-        <w:t xml:space="preserve"> </w:t>
-      </w:r>
-      <w:proofErr w:type="spellStart"/>
-      <w:r>
-        <w:t>jisme</w:t>
-      </w:r>
-      <w:proofErr w:type="spellEnd"/>
-      <w:r>
-        <w:t xml:space="preserve"> tum coding </w:t>
-      </w:r>
-      <w:proofErr w:type="spellStart"/>
-      <w:r>
-        <w:t>likhte</w:t>
-      </w:r>
-      <w:proofErr w:type="spellEnd"/>
-      <w:r>
-        <w:t xml:space="preserve"> </w:t>
-      </w:r>
-      <w:proofErr w:type="spellStart"/>
-      <w:r>
-        <w:t>ho</w:t>
-      </w:r>
-      <w:proofErr w:type="spellEnd"/>
-      <w:r>
-        <w:t xml:space="preserve">, </w:t>
-      </w:r>
-      <w:proofErr w:type="spellStart"/>
-      <w:r>
-        <w:t>isliye</w:t>
-      </w:r>
-      <w:proofErr w:type="spellEnd"/>
-      <w:r>
-        <w:t xml:space="preserve"> tum </w:t>
-      </w:r>
-      <w:proofErr w:type="spellStart"/>
-      <w:r>
-        <w:t>isme</w:t>
-      </w:r>
-      <w:proofErr w:type="spellEnd"/>
-      <w:r>
-        <w:t xml:space="preserve"> </w:t>
-      </w:r>
+    </w:p>
+    <w:p>
       <w:r>
         <w:rPr>
           <w:b/>
           <w:bCs/>
         </w:rPr>
-        <w:t>edit</w:t>
+        <w:t>class files are for the computer:</w:t>
       </w:r>
       <w:r>
-        <w:t xml:space="preserve"> </w:t>
-      </w:r>
-      <w:proofErr w:type="spellStart"/>
-      <w:r>
-        <w:t>kar</w:t>
-      </w:r>
-      <w:proofErr w:type="spellEnd"/>
-      <w:r>
-        <w:t xml:space="preserve"> </w:t>
-      </w:r>
-      <w:proofErr w:type="spellStart"/>
-      <w:r>
-        <w:t>sakte</w:t>
-      </w:r>
-      <w:proofErr w:type="spellEnd"/>
-      <w:r>
-        <w:t xml:space="preserve"> ho.</w:t>
-      </w:r>
-    </w:p>
-    <w:p>
-      <w:pPr>
-        <w:numPr>
-          <w:ilvl w:val="0"/>
-          <w:numId w:val="1"/>
-        </w:numPr>
-      </w:pPr>
-      <w:r>
-        <w:rPr>
-          <w:b/>
-          <w:bCs/>
-        </w:rPr>
-        <w:t>demo3.class</w:t>
-      </w:r>
-      <w:r>
-        <w:t xml:space="preserve"> ek machine-readable file </w:t>
-      </w:r>
-      <w:proofErr w:type="spellStart"/>
-      <w:r>
-        <w:t>hai</w:t>
-      </w:r>
-      <w:proofErr w:type="spellEnd"/>
-      <w:r>
-        <w:t xml:space="preserve"> jo </w:t>
-      </w:r>
-      <w:proofErr w:type="spellStart"/>
-      <w:r>
-        <w:t>javac</w:t>
-      </w:r>
-      <w:proofErr w:type="spellEnd"/>
-      <w:r>
-        <w:t xml:space="preserve"> command </w:t>
-      </w:r>
-      <w:proofErr w:type="spellStart"/>
-      <w:r>
-        <w:t>chalane</w:t>
-      </w:r>
-      <w:proofErr w:type="spellEnd"/>
-      <w:r>
-        <w:t xml:space="preserve"> </w:t>
-      </w:r>
-      <w:proofErr w:type="spellStart"/>
-      <w:r>
-        <w:t>ke</w:t>
-      </w:r>
-      <w:proofErr w:type="spellEnd"/>
-      <w:r>
-        <w:t xml:space="preserve"> </w:t>
-      </w:r>
-      <w:proofErr w:type="spellStart"/>
-      <w:r>
-        <w:t>baad</w:t>
-      </w:r>
-      <w:proofErr w:type="spellEnd"/>
-      <w:r>
-        <w:t xml:space="preserve"> </w:t>
-      </w:r>
-      <w:proofErr w:type="spellStart"/>
-      <w:r>
-        <w:t>apne</w:t>
-      </w:r>
-      <w:proofErr w:type="spellEnd"/>
-      <w:r>
-        <w:t xml:space="preserve"> </w:t>
-      </w:r>
-      <w:proofErr w:type="spellStart"/>
-      <w:r>
-        <w:t>aap</w:t>
-      </w:r>
-      <w:proofErr w:type="spellEnd"/>
-      <w:r>
-        <w:t xml:space="preserve"> </w:t>
-      </w:r>
-      <w:proofErr w:type="spellStart"/>
-      <w:r>
-        <w:t>banti</w:t>
-      </w:r>
-      <w:proofErr w:type="spellEnd"/>
-      <w:r>
-        <w:t xml:space="preserve"> </w:t>
-      </w:r>
-      <w:proofErr w:type="spellStart"/>
-      <w:r>
-        <w:t>hai</w:t>
-      </w:r>
-      <w:proofErr w:type="spellEnd"/>
-      <w:r>
-        <w:t>.</w:t>
-      </w:r>
-    </w:p>
-    <w:p>
-      <w:pPr>
-        <w:numPr>
-          <w:ilvl w:val="0"/>
-          <w:numId w:val="1"/>
-        </w:numPr>
-      </w:pPr>
-      <w:r>
-        <w:t xml:space="preserve">.class file ko tum </w:t>
-      </w:r>
-      <w:r>
-        <w:rPr>
-          <w:b/>
-          <w:bCs/>
-        </w:rPr>
-        <w:t xml:space="preserve">edit </w:t>
-      </w:r>
-      <w:proofErr w:type="spellStart"/>
-      <w:r>
-        <w:rPr>
-          <w:b/>
-          <w:bCs/>
-        </w:rPr>
-        <w:t>nahi</w:t>
-      </w:r>
-      <w:proofErr w:type="spellEnd"/>
-      <w:r>
-        <w:rPr>
-          <w:b/>
-          <w:bCs/>
-        </w:rPr>
-        <w:t xml:space="preserve"> </w:t>
-      </w:r>
-      <w:proofErr w:type="spellStart"/>
-      <w:r>
-        <w:rPr>
-          <w:b/>
-          <w:bCs/>
-        </w:rPr>
-        <w:t>kar</w:t>
-      </w:r>
-      <w:proofErr w:type="spellEnd"/>
-      <w:r>
-        <w:rPr>
-          <w:b/>
-          <w:bCs/>
-        </w:rPr>
-        <w:t xml:space="preserve"> </w:t>
-      </w:r>
-      <w:proofErr w:type="spellStart"/>
-      <w:r>
-        <w:rPr>
-          <w:b/>
-          <w:bCs/>
-        </w:rPr>
-        <w:t>sakte</w:t>
-      </w:r>
-      <w:proofErr w:type="spellEnd"/>
-      <w:r>
-        <w:t xml:space="preserve"> </w:t>
-      </w:r>
-      <w:proofErr w:type="spellStart"/>
-      <w:r>
-        <w:t>kyunki</w:t>
-      </w:r>
-      <w:proofErr w:type="spellEnd"/>
-      <w:r>
-        <w:t xml:space="preserve"> wo </w:t>
-      </w:r>
-      <w:proofErr w:type="spellStart"/>
-      <w:r>
-        <w:t>sirf</w:t>
-      </w:r>
-      <w:proofErr w:type="spellEnd"/>
-      <w:r>
-        <w:t xml:space="preserve"> Computer/JVM (Java Virtual Machine) </w:t>
-      </w:r>
-      <w:proofErr w:type="spellStart"/>
-      <w:r>
-        <w:t>ke</w:t>
-      </w:r>
-      <w:proofErr w:type="spellEnd"/>
-      <w:r>
-        <w:t xml:space="preserve"> </w:t>
-      </w:r>
-      <w:proofErr w:type="spellStart"/>
-      <w:r>
-        <w:t>samajhne</w:t>
-      </w:r>
-      <w:proofErr w:type="spellEnd"/>
-      <w:r>
-        <w:t xml:space="preserve"> </w:t>
-      </w:r>
-      <w:proofErr w:type="spellStart"/>
-      <w:r>
-        <w:t>ke</w:t>
-      </w:r>
-      <w:proofErr w:type="spellEnd"/>
-      <w:r>
-        <w:t xml:space="preserve"> </w:t>
-      </w:r>
-      <w:proofErr w:type="spellStart"/>
-      <w:r>
-        <w:t>liye</w:t>
-      </w:r>
-      <w:proofErr w:type="spellEnd"/>
-      <w:r>
-        <w:t xml:space="preserve"> bani </w:t>
-      </w:r>
-      <w:proofErr w:type="spellStart"/>
-      <w:r>
-        <w:t>hai</w:t>
-      </w:r>
-      <w:proofErr w:type="spellEnd"/>
-      <w:r>
-        <w:t xml:space="preserve">, </w:t>
-      </w:r>
-      <w:proofErr w:type="spellStart"/>
-      <w:r>
-        <w:t>insaano</w:t>
-      </w:r>
-      <w:proofErr w:type="spellEnd"/>
-      <w:r>
-        <w:t xml:space="preserve"> </w:t>
-      </w:r>
-      <w:proofErr w:type="spellStart"/>
-      <w:r>
-        <w:t>ke</w:t>
-      </w:r>
-      <w:proofErr w:type="spellEnd"/>
-      <w:r>
-        <w:t xml:space="preserve"> </w:t>
-      </w:r>
-      <w:proofErr w:type="spellStart"/>
-      <w:r>
-        <w:t>padhne</w:t>
-      </w:r>
-      <w:proofErr w:type="spellEnd"/>
-      <w:r>
-        <w:t xml:space="preserve"> </w:t>
-      </w:r>
-      <w:proofErr w:type="spellStart"/>
-      <w:r>
-        <w:t>ya</w:t>
-      </w:r>
-      <w:proofErr w:type="spellEnd"/>
-      <w:r>
-        <w:t xml:space="preserve"> edit </w:t>
-      </w:r>
-      <w:proofErr w:type="spellStart"/>
-      <w:r>
-        <w:t>karne</w:t>
-      </w:r>
-      <w:proofErr w:type="spellEnd"/>
-      <w:r>
-        <w:t xml:space="preserve"> </w:t>
-      </w:r>
-      <w:proofErr w:type="spellStart"/>
-      <w:r>
-        <w:t>ke</w:t>
-      </w:r>
-      <w:proofErr w:type="spellEnd"/>
-      <w:r>
-        <w:t xml:space="preserve"> </w:t>
-      </w:r>
-      <w:proofErr w:type="spellStart"/>
-      <w:r>
-        <w:t>liye</w:t>
-      </w:r>
-      <w:proofErr w:type="spellEnd"/>
-      <w:r>
-        <w:t xml:space="preserve"> </w:t>
-      </w:r>
-      <w:proofErr w:type="spellStart"/>
-      <w:r>
-        <w:t>nahi</w:t>
-      </w:r>
-      <w:proofErr w:type="spellEnd"/>
-      <w:r>
-        <w:t>.</w:t>
-      </w:r>
-    </w:p>
-    <w:p>
-      <w:pPr>
-        <w:numPr>
-          <w:ilvl w:val="0"/>
-          <w:numId w:val="1"/>
-        </w:numPr>
-      </w:pPr>
-      <w:r>
-        <w:t xml:space="preserve">Jab tum terminal </w:t>
-      </w:r>
-      <w:proofErr w:type="spellStart"/>
-      <w:r>
-        <w:t>mein</w:t>
-      </w:r>
-      <w:proofErr w:type="spellEnd"/>
-      <w:r>
-        <w:t xml:space="preserve"> java demo3 </w:t>
-      </w:r>
-      <w:proofErr w:type="spellStart"/>
-      <w:r>
-        <w:t>likhte</w:t>
-      </w:r>
-      <w:proofErr w:type="spellEnd"/>
-      <w:r>
-        <w:t xml:space="preserve"> </w:t>
-      </w:r>
-      <w:proofErr w:type="spellStart"/>
-      <w:r>
-        <w:t>ho</w:t>
-      </w:r>
-      <w:proofErr w:type="spellEnd"/>
-      <w:r>
-        <w:t xml:space="preserve">, </w:t>
-      </w:r>
-      <w:proofErr w:type="spellStart"/>
-      <w:r>
-        <w:t>toh</w:t>
-      </w:r>
-      <w:proofErr w:type="spellEnd"/>
-      <w:r>
-        <w:t xml:space="preserve"> </w:t>
-      </w:r>
-      <w:proofErr w:type="spellStart"/>
-      <w:r>
-        <w:t>tumhara</w:t>
-      </w:r>
-      <w:proofErr w:type="spellEnd"/>
-      <w:r>
-        <w:t xml:space="preserve"> computer </w:t>
-      </w:r>
-      <w:proofErr w:type="spellStart"/>
-      <w:r>
-        <w:t>apne</w:t>
-      </w:r>
-      <w:proofErr w:type="spellEnd"/>
-      <w:r>
-        <w:t xml:space="preserve"> </w:t>
-      </w:r>
-      <w:proofErr w:type="spellStart"/>
-      <w:r>
-        <w:t>aap</w:t>
-      </w:r>
-      <w:proofErr w:type="spellEnd"/>
-      <w:r>
-        <w:t xml:space="preserve"> us .class file ko </w:t>
-      </w:r>
-      <w:proofErr w:type="spellStart"/>
-      <w:r>
-        <w:t>dhundh</w:t>
-      </w:r>
-      <w:proofErr w:type="spellEnd"/>
-      <w:r>
-        <w:t xml:space="preserve"> </w:t>
-      </w:r>
-      <w:proofErr w:type="spellStart"/>
-      <w:r>
-        <w:t>leta</w:t>
-      </w:r>
-      <w:proofErr w:type="spellEnd"/>
-      <w:r>
-        <w:t xml:space="preserve"> </w:t>
-      </w:r>
-      <w:proofErr w:type="spellStart"/>
-      <w:r>
-        <w:t>hai</w:t>
-      </w:r>
-      <w:proofErr w:type="spellEnd"/>
-      <w:r>
-        <w:t xml:space="preserve"> aur </w:t>
-      </w:r>
-      <w:proofErr w:type="spellStart"/>
-      <w:r>
-        <w:t>chala</w:t>
-      </w:r>
-      <w:proofErr w:type="spellEnd"/>
-      <w:r>
-        <w:t xml:space="preserve"> </w:t>
-      </w:r>
-      <w:proofErr w:type="spellStart"/>
-      <w:r>
-        <w:t>deta</w:t>
-      </w:r>
-      <w:proofErr w:type="spellEnd"/>
-      <w:r>
-        <w:t xml:space="preserve"> </w:t>
-      </w:r>
-      <w:proofErr w:type="spellStart"/>
-      <w:r>
-        <w:t>hai</w:t>
-      </w:r>
-      <w:proofErr w:type="spellEnd"/>
-      <w:r>
-        <w:t>.</w:t>
-      </w:r>
-    </w:p>
-    <w:p>
-      <w:proofErr w:type="spellStart"/>
-      <w:r>
-        <w:rPr>
-          <w:b/>
-          <w:bCs/>
-        </w:rPr>
-        <w:t>Seedha</w:t>
-      </w:r>
-      <w:proofErr w:type="spellEnd"/>
-      <w:r>
-        <w:rPr>
-          <w:b/>
-          <w:bCs/>
-        </w:rPr>
-        <w:t xml:space="preserve"> </w:t>
-      </w:r>
-      <w:proofErr w:type="spellStart"/>
-      <w:r>
-        <w:rPr>
-          <w:b/>
-          <w:bCs/>
-        </w:rPr>
-        <w:t>sa</w:t>
-      </w:r>
-      <w:proofErr w:type="spellEnd"/>
-      <w:r>
-        <w:rPr>
-          <w:b/>
-          <w:bCs/>
-        </w:rPr>
-        <w:t xml:space="preserve"> rule </w:t>
-      </w:r>
-      <w:proofErr w:type="spellStart"/>
-      <w:r>
-        <w:rPr>
-          <w:b/>
-          <w:bCs/>
-        </w:rPr>
-        <w:t>yaad</w:t>
-      </w:r>
-      <w:proofErr w:type="spellEnd"/>
-      <w:r>
-        <w:rPr>
-          <w:b/>
-          <w:bCs/>
-        </w:rPr>
-        <w:t xml:space="preserve"> </w:t>
-      </w:r>
-      <w:proofErr w:type="spellStart"/>
-      <w:r>
-        <w:rPr>
-          <w:b/>
-          <w:bCs/>
-        </w:rPr>
-        <w:t>rakho</w:t>
-      </w:r>
-      <w:proofErr w:type="spellEnd"/>
-      <w:r>
-        <w:rPr>
-          <w:b/>
-          <w:bCs/>
-        </w:rPr>
-        <w:t>:</w:t>
-      </w:r>
-    </w:p>
-    <w:p>
-      <w:pPr>
-        <w:numPr>
-          <w:ilvl w:val="0"/>
-          <w:numId w:val="2"/>
-        </w:numPr>
-      </w:pPr>
-      <w:r>
-        <w:rPr>
-          <w:b/>
-          <w:bCs/>
-        </w:rPr>
-        <w:t>Edit</w:t>
-      </w:r>
-      <w:r>
-        <w:t xml:space="preserve"> </w:t>
-      </w:r>
-      <w:proofErr w:type="spellStart"/>
-      <w:r>
-        <w:t>hamesha</w:t>
-      </w:r>
-      <w:proofErr w:type="spellEnd"/>
-      <w:r>
-        <w:t xml:space="preserve"> .java </w:t>
-      </w:r>
-      <w:proofErr w:type="spellStart"/>
-      <w:r>
-        <w:t>wali</w:t>
-      </w:r>
-      <w:proofErr w:type="spellEnd"/>
-      <w:r>
-        <w:t xml:space="preserve"> file </w:t>
-      </w:r>
-      <w:proofErr w:type="spellStart"/>
-      <w:r>
-        <w:t>mein</w:t>
-      </w:r>
-      <w:proofErr w:type="spellEnd"/>
-      <w:r>
-        <w:t xml:space="preserve"> hi </w:t>
-      </w:r>
-      <w:proofErr w:type="spellStart"/>
-      <w:r>
-        <w:t>karna</w:t>
-      </w:r>
-      <w:proofErr w:type="spellEnd"/>
-      <w:r>
-        <w:t xml:space="preserve"> </w:t>
-      </w:r>
-      <w:proofErr w:type="spellStart"/>
-      <w:r>
-        <w:t>hai</w:t>
-      </w:r>
-      <w:proofErr w:type="spellEnd"/>
-      <w:r>
-        <w:t>.</w:t>
-      </w:r>
-    </w:p>
-    <w:p>
-      <w:pPr>
-        <w:numPr>
-          <w:ilvl w:val="0"/>
-          <w:numId w:val="2"/>
-        </w:numPr>
-      </w:pPr>
-      <w:r>
-        <w:rPr>
-          <w:b/>
-          <w:bCs/>
-        </w:rPr>
-        <w:t>Run</w:t>
-      </w:r>
-      <w:r>
-        <w:t xml:space="preserve"> </w:t>
-      </w:r>
-      <w:proofErr w:type="spellStart"/>
-      <w:r>
-        <w:t>karne</w:t>
-      </w:r>
-      <w:proofErr w:type="spellEnd"/>
-      <w:r>
-        <w:t xml:space="preserve"> </w:t>
-      </w:r>
-      <w:proofErr w:type="spellStart"/>
-      <w:r>
-        <w:t>ke</w:t>
-      </w:r>
-      <w:proofErr w:type="spellEnd"/>
-      <w:r>
-        <w:t xml:space="preserve"> </w:t>
-      </w:r>
-      <w:proofErr w:type="spellStart"/>
-      <w:r>
-        <w:t>liye</w:t>
-      </w:r>
-      <w:proofErr w:type="spellEnd"/>
-      <w:r>
-        <w:t xml:space="preserve"> </w:t>
-      </w:r>
-      <w:proofErr w:type="spellStart"/>
-      <w:r>
-        <w:t>hamesha</w:t>
-      </w:r>
-      <w:proofErr w:type="spellEnd"/>
-      <w:r>
-        <w:t xml:space="preserve"> terminal </w:t>
-      </w:r>
-      <w:proofErr w:type="spellStart"/>
-      <w:r>
-        <w:t>mein</w:t>
-      </w:r>
-      <w:proofErr w:type="spellEnd"/>
-      <w:r>
-        <w:t xml:space="preserve"> java command ka hi use </w:t>
-      </w:r>
-      <w:proofErr w:type="spellStart"/>
-      <w:r>
-        <w:t>karna</w:t>
-      </w:r>
-      <w:proofErr w:type="spellEnd"/>
-      <w:r>
-        <w:t xml:space="preserve"> </w:t>
-      </w:r>
-      <w:proofErr w:type="spellStart"/>
-      <w:r>
-        <w:t>hai</w:t>
-      </w:r>
-      <w:proofErr w:type="spellEnd"/>
-      <w:r>
-        <w:t>.</w:t>
-      </w:r>
-    </w:p>
-    <w:p>
-      <w:r>
-        <w:t xml:space="preserve">.class file ko edit </w:t>
-      </w:r>
-      <w:proofErr w:type="spellStart"/>
-      <w:r>
-        <w:t>karne</w:t>
-      </w:r>
-      <w:proofErr w:type="spellEnd"/>
-      <w:r>
-        <w:t xml:space="preserve"> ki </w:t>
-      </w:r>
-      <w:proofErr w:type="spellStart"/>
-      <w:r>
-        <w:t>koshish</w:t>
-      </w:r>
-      <w:proofErr w:type="spellEnd"/>
-      <w:r>
-        <w:t xml:space="preserve"> mat karo, wo bas </w:t>
-      </w:r>
-      <w:proofErr w:type="spellStart"/>
-      <w:r>
-        <w:t>waha</w:t>
-      </w:r>
-      <w:proofErr w:type="spellEnd"/>
-      <w:r>
-        <w:t xml:space="preserve"> padi </w:t>
-      </w:r>
-      <w:proofErr w:type="spellStart"/>
-      <w:r>
-        <w:t>rahegi</w:t>
-      </w:r>
-      <w:proofErr w:type="spellEnd"/>
-      <w:r>
-        <w:t xml:space="preserve">, </w:t>
-      </w:r>
-      <w:proofErr w:type="spellStart"/>
-      <w:r>
-        <w:t>uska</w:t>
-      </w:r>
-      <w:proofErr w:type="spellEnd"/>
-      <w:r>
-        <w:t xml:space="preserve"> </w:t>
-      </w:r>
-      <w:proofErr w:type="spellStart"/>
-      <w:r>
-        <w:t>kaam</w:t>
-      </w:r>
-      <w:proofErr w:type="spellEnd"/>
-      <w:r>
-        <w:t xml:space="preserve"> </w:t>
-      </w:r>
-      <w:proofErr w:type="spellStart"/>
-      <w:r>
-        <w:t>tumhara</w:t>
-      </w:r>
-      <w:proofErr w:type="spellEnd"/>
-      <w:r>
-        <w:t xml:space="preserve"> compiler </w:t>
-      </w:r>
-      <w:proofErr w:type="spellStart"/>
-      <w:r>
-        <w:t>sambhaal</w:t>
-      </w:r>
-      <w:proofErr w:type="spellEnd"/>
-      <w:r>
-        <w:t xml:space="preserve"> </w:t>
-      </w:r>
-      <w:proofErr w:type="spellStart"/>
-      <w:r>
-        <w:t>lega</w:t>
-      </w:r>
-      <w:proofErr w:type="spellEnd"/>
-      <w:r>
-        <w:t>!</w:t>
+        <w:t xml:space="preserve"> You do not need to open or change these; the computer creates and uses them automatically to run your program.</w:t>
       </w:r>
     </w:p>
     <w:p/>

</xml_diff>